<commit_message>
fix robustness of task verification
</commit_message>
<xml_diff>
--- a/tasks/finalpool/canvas-assignment-feedback-gform-word/groundtruth_workspace/Assignment_Analysis.docx
+++ b/tasks/finalpool/canvas-assignment-feedback-gform-word/groundtruth_workspace/Assignment_Analysis.docx
@@ -4,7 +4,7 @@
   <w:body>
     <w:p>
       <w:pPr>
-        <w:pStyle w:val="Title"/>
+        <w:pStyle w:val="Heading1"/>
       </w:pPr>
       <w:r>
         <w:t>Foundations of Finance (Fall 2013) - Assignment Analysis</w:t>
@@ -12,7 +12,7 @@
     </w:p>
     <w:tbl>
       <w:tblPr>
-        <w:tblStyle w:val="TableGrid"/>
+        <w:tblStyle w:val="LightGrid"/>
         <w:tblW w:type="auto" w:w="0"/>
         <w:tblLook w:firstColumn="1" w:firstRow="1" w:lastColumn="0" w:lastRow="0" w:noHBand="0" w:noVBand="1" w:val="04A0"/>
       </w:tblPr>
@@ -82,7 +82,7 @@
           </w:tcPr>
           <w:p>
             <w:r>
-              <w:t>CMA 34904</w:t>
+              <w:t>CMA 34878</w:t>
             </w:r>
           </w:p>
         </w:tc>
@@ -92,7 +92,7 @@
           </w:tcPr>
           <w:p>
             <w:r>
-              <w:t>1454</w:t>
+              <w:t>1470</w:t>
             </w:r>
           </w:p>
         </w:tc>
@@ -102,7 +102,7 @@
           </w:tcPr>
           <w:p>
             <w:r>
-              <w:t>85.1</w:t>
+              <w:t>83.32</w:t>
             </w:r>
           </w:p>
         </w:tc>
@@ -112,7 +112,7 @@
           </w:tcPr>
           <w:p>
             <w:r>
-              <w:t>32</w:t>
+              <w:t>36</w:t>
             </w:r>
           </w:p>
         </w:tc>
@@ -122,7 +122,7 @@
           </w:tcPr>
           <w:p>
             <w:r>
-              <w:t>2.2</w:t>
+              <w:t>2.45</w:t>
             </w:r>
           </w:p>
         </w:tc>
@@ -134,7 +134,7 @@
           </w:tcPr>
           <w:p>
             <w:r>
-              <w:t>CMA 34905</w:t>
+              <w:t>CMA 34879</w:t>
             </w:r>
           </w:p>
         </w:tc>
@@ -144,7 +144,7 @@
           </w:tcPr>
           <w:p>
             <w:r>
-              <w:t>1363</w:t>
+              <w:t>1352</w:t>
             </w:r>
           </w:p>
         </w:tc>
@@ -154,7 +154,7 @@
           </w:tcPr>
           <w:p>
             <w:r>
-              <w:t>88.25</w:t>
+              <w:t>87.97</w:t>
             </w:r>
           </w:p>
         </w:tc>
@@ -164,7 +164,7 @@
           </w:tcPr>
           <w:p>
             <w:r>
-              <w:t>45</w:t>
+              <w:t>43</w:t>
             </w:r>
           </w:p>
         </w:tc>
@@ -174,7 +174,7 @@
           </w:tcPr>
           <w:p>
             <w:r>
-              <w:t>3.3</w:t>
+              <w:t>3.18</w:t>
             </w:r>
           </w:p>
         </w:tc>
@@ -186,7 +186,7 @@
           </w:tcPr>
           <w:p>
             <w:r>
-              <w:t>CMA 34906</w:t>
+              <w:t>CMA 34880</w:t>
             </w:r>
           </w:p>
         </w:tc>
@@ -196,7 +196,7 @@
           </w:tcPr>
           <w:p>
             <w:r>
-              <w:t>1254</w:t>
+              <w:t>1252</w:t>
             </w:r>
           </w:p>
         </w:tc>
@@ -206,7 +206,7 @@
           </w:tcPr>
           <w:p>
             <w:r>
-              <w:t>77.22</w:t>
+              <w:t>76.5</w:t>
             </w:r>
           </w:p>
         </w:tc>
@@ -216,7 +216,7 @@
           </w:tcPr>
           <w:p>
             <w:r>
-              <w:t>70</w:t>
+              <w:t>61</w:t>
             </w:r>
           </w:p>
         </w:tc>
@@ -226,7 +226,7 @@
           </w:tcPr>
           <w:p>
             <w:r>
-              <w:t>5.58</w:t>
+              <w:t>4.87</w:t>
             </w:r>
           </w:p>
         </w:tc>
@@ -238,7 +238,7 @@
           </w:tcPr>
           <w:p>
             <w:r>
-              <w:t>CMA 34907</w:t>
+              <w:t>CMA 34881</w:t>
             </w:r>
           </w:p>
         </w:tc>
@@ -248,7 +248,7 @@
           </w:tcPr>
           <w:p>
             <w:r>
-              <w:t>1234</w:t>
+              <w:t>1224</w:t>
             </w:r>
           </w:p>
         </w:tc>
@@ -258,7 +258,7 @@
           </w:tcPr>
           <w:p>
             <w:r>
-              <w:t>78.81</w:t>
+              <w:t>78.3</w:t>
             </w:r>
           </w:p>
         </w:tc>
@@ -268,7 +268,7 @@
           </w:tcPr>
           <w:p>
             <w:r>
-              <w:t>72</w:t>
+              <w:t>59</w:t>
             </w:r>
           </w:p>
         </w:tc>
@@ -278,7 +278,7 @@
           </w:tcPr>
           <w:p>
             <w:r>
-              <w:t>5.83</w:t>
+              <w:t>4.82</w:t>
             </w:r>
           </w:p>
         </w:tc>
@@ -290,7 +290,7 @@
           </w:tcPr>
           <w:p>
             <w:r>
-              <w:t>CMA 34908</w:t>
+              <w:t>CMA 34882</w:t>
             </w:r>
           </w:p>
         </w:tc>
@@ -300,7 +300,7 @@
           </w:tcPr>
           <w:p>
             <w:r>
-              <w:t>1213</w:t>
+              <w:t>1193</w:t>
             </w:r>
           </w:p>
         </w:tc>
@@ -310,7 +310,7 @@
           </w:tcPr>
           <w:p>
             <w:r>
-              <w:t>78.76</w:t>
+              <w:t>78.65</w:t>
             </w:r>
           </w:p>
         </w:tc>
@@ -320,7 +320,7 @@
           </w:tcPr>
           <w:p>
             <w:r>
-              <w:t>85</w:t>
+              <w:t>75</w:t>
             </w:r>
           </w:p>
         </w:tc>
@@ -330,7 +330,7 @@
           </w:tcPr>
           <w:p>
             <w:r>
-              <w:t>7.01</w:t>
+              <w:t>6.29</w:t>
             </w:r>
           </w:p>
         </w:tc>
@@ -342,7 +342,7 @@
           </w:tcPr>
           <w:p>
             <w:r>
-              <w:t>CMA 34909</w:t>
+              <w:t>CMA 34883</w:t>
             </w:r>
           </w:p>
         </w:tc>
@@ -352,7 +352,7 @@
           </w:tcPr>
           <w:p>
             <w:r>
-              <w:t>1213</w:t>
+              <w:t>1196</w:t>
             </w:r>
           </w:p>
         </w:tc>
@@ -362,7 +362,7 @@
           </w:tcPr>
           <w:p>
             <w:r>
-              <w:t>77.1</w:t>
+              <w:t>76.8</w:t>
             </w:r>
           </w:p>
         </w:tc>
@@ -372,7 +372,7 @@
           </w:tcPr>
           <w:p>
             <w:r>
-              <w:t>134</w:t>
+              <w:t>119</w:t>
             </w:r>
           </w:p>
         </w:tc>
@@ -382,7 +382,7 @@
           </w:tcPr>
           <w:p>
             <w:r>
-              <w:t>11.05</w:t>
+              <w:t>9.95</w:t>
             </w:r>
           </w:p>
         </w:tc>
@@ -394,7 +394,7 @@
           </w:tcPr>
           <w:p>
             <w:r>
-              <w:t>CMA 34910</w:t>
+              <w:t>CMA 34884</w:t>
             </w:r>
           </w:p>
         </w:tc>
@@ -404,7 +404,7 @@
           </w:tcPr>
           <w:p>
             <w:r>
-              <w:t>1184</w:t>
+              <w:t>1160</w:t>
             </w:r>
           </w:p>
         </w:tc>
@@ -414,7 +414,7 @@
           </w:tcPr>
           <w:p>
             <w:r>
-              <w:t>77.33</w:t>
+              <w:t>76.16</w:t>
             </w:r>
           </w:p>
         </w:tc>
@@ -424,7 +424,7 @@
           </w:tcPr>
           <w:p>
             <w:r>
-              <w:t>118</w:t>
+              <w:t>88</w:t>
             </w:r>
           </w:p>
         </w:tc>
@@ -434,7 +434,7 @@
           </w:tcPr>
           <w:p>
             <w:r>
-              <w:t>9.97</w:t>
+              <w:t>7.59</w:t>
             </w:r>
           </w:p>
         </w:tc>
@@ -446,7 +446,7 @@
           </w:tcPr>
           <w:p>
             <w:r>
-              <w:t>TMA 34899</w:t>
+              <w:t>TMA 34873</w:t>
             </w:r>
           </w:p>
         </w:tc>
@@ -456,7 +456,7 @@
           </w:tcPr>
           <w:p>
             <w:r>
-              <w:t>1826</w:t>
+              <w:t>1859</w:t>
             </w:r>
           </w:p>
         </w:tc>
@@ -466,7 +466,7 @@
           </w:tcPr>
           <w:p>
             <w:r>
-              <w:t>78.6</w:t>
+              <w:t>78.16</w:t>
             </w:r>
           </w:p>
         </w:tc>
@@ -476,7 +476,7 @@
           </w:tcPr>
           <w:p>
             <w:r>
-              <w:t>173</w:t>
+              <w:t>157</w:t>
             </w:r>
           </w:p>
         </w:tc>
@@ -486,7 +486,7 @@
           </w:tcPr>
           <w:p>
             <w:r>
-              <w:t>9.47</w:t>
+              <w:t>8.45</w:t>
             </w:r>
           </w:p>
         </w:tc>
@@ -498,7 +498,7 @@
           </w:tcPr>
           <w:p>
             <w:r>
-              <w:t>TMA 34900</w:t>
+              <w:t>TMA 34874</w:t>
             </w:r>
           </w:p>
         </w:tc>
@@ -508,7 +508,7 @@
           </w:tcPr>
           <w:p>
             <w:r>
-              <w:t>1601</w:t>
+              <w:t>1661</w:t>
             </w:r>
           </w:p>
         </w:tc>
@@ -518,7 +518,7 @@
           </w:tcPr>
           <w:p>
             <w:r>
-              <w:t>78.11</w:t>
+              <w:t>72.45</w:t>
             </w:r>
           </w:p>
         </w:tc>
@@ -528,7 +528,7 @@
           </w:tcPr>
           <w:p>
             <w:r>
-              <w:t>212</w:t>
+              <w:t>193</w:t>
             </w:r>
           </w:p>
         </w:tc>
@@ -538,7 +538,7 @@
           </w:tcPr>
           <w:p>
             <w:r>
-              <w:t>13.24</w:t>
+              <w:t>11.62</w:t>
             </w:r>
           </w:p>
         </w:tc>
@@ -550,7 +550,7 @@
           </w:tcPr>
           <w:p>
             <w:r>
-              <w:t>TMA 34901</w:t>
+              <w:t>TMA 34875</w:t>
             </w:r>
           </w:p>
         </w:tc>
@@ -560,7 +560,7 @@
           </w:tcPr>
           <w:p>
             <w:r>
-              <w:t>1398</w:t>
+              <w:t>1402</w:t>
             </w:r>
           </w:p>
         </w:tc>
@@ -570,7 +570,7 @@
           </w:tcPr>
           <w:p>
             <w:r>
-              <w:t>74.28</w:t>
+              <w:t>70.49</w:t>
             </w:r>
           </w:p>
         </w:tc>
@@ -580,7 +580,7 @@
           </w:tcPr>
           <w:p>
             <w:r>
-              <w:t>322</w:t>
+              <w:t>376</w:t>
             </w:r>
           </w:p>
         </w:tc>
@@ -590,7 +590,7 @@
           </w:tcPr>
           <w:p>
             <w:r>
-              <w:t>23.03</w:t>
+              <w:t>26.82</w:t>
             </w:r>
           </w:p>
         </w:tc>
@@ -602,7 +602,7 @@
           </w:tcPr>
           <w:p>
             <w:r>
-              <w:t>TMA 34902</w:t>
+              <w:t>TMA 34876</w:t>
             </w:r>
           </w:p>
         </w:tc>
@@ -612,7 +612,7 @@
           </w:tcPr>
           <w:p>
             <w:r>
-              <w:t>1307</w:t>
+              <w:t>1313</w:t>
             </w:r>
           </w:p>
         </w:tc>
@@ -622,7 +622,7 @@
           </w:tcPr>
           <w:p>
             <w:r>
-              <w:t>73.48</w:t>
+              <w:t>71.05</w:t>
             </w:r>
           </w:p>
         </w:tc>
@@ -632,7 +632,7 @@
           </w:tcPr>
           <w:p>
             <w:r>
-              <w:t>257</w:t>
+              <w:t>268</w:t>
             </w:r>
           </w:p>
         </w:tc>
@@ -642,7 +642,7 @@
           </w:tcPr>
           <w:p>
             <w:r>
-              <w:t>19.66</w:t>
+              <w:t>20.41</w:t>
             </w:r>
           </w:p>
         </w:tc>
@@ -654,7 +654,7 @@
           </w:tcPr>
           <w:p>
             <w:r>
-              <w:t>TMA 34903</w:t>
+              <w:t>TMA 34877</w:t>
             </w:r>
           </w:p>
         </w:tc>
@@ -664,7 +664,7 @@
           </w:tcPr>
           <w:p>
             <w:r>
-              <w:t>1137</w:t>
+              <w:t>1158</w:t>
             </w:r>
           </w:p>
         </w:tc>
@@ -674,7 +674,7 @@
           </w:tcPr>
           <w:p>
             <w:r>
-              <w:t>76.36</w:t>
+              <w:t>75.89</w:t>
             </w:r>
           </w:p>
         </w:tc>
@@ -684,7 +684,7 @@
           </w:tcPr>
           <w:p>
             <w:r>
-              <w:t>149</w:t>
+              <w:t>148</w:t>
             </w:r>
           </w:p>
         </w:tc>
@@ -694,7 +694,7 @@
           </w:tcPr>
           <w:p>
             <w:r>
-              <w:t>13.1</w:t>
+              <w:t>12.78</w:t>
             </w:r>
           </w:p>
         </w:tc>

</xml_diff>